<commit_message>
Complete coordinated spatial demo and production report portfolio
</commit_message>
<xml_diff>
--- a/output/pdf/BUI-1042-issue-package.docx
+++ b/output/pdf/BUI-1042-issue-package.docx
@@ -59,10 +59,10 @@
         <w:tblInd w:w="120" w:type="dxa"/>
       </w:tblPr>
       <w:tblGrid>
-        <w:gridCol w:w="1400"/>
-        <w:gridCol w:w="3000"/>
-        <w:gridCol w:w="2200"/>
-        <w:gridCol w:w="2760"/>
+        <w:gridCol w:w="2340"/>
+        <w:gridCol w:w="2340"/>
+        <w:gridCol w:w="2340"/>
+        <w:gridCol w:w="2340"/>
       </w:tblGrid>
       <w:tr>
         <w:trPr>
@@ -70,7 +70,7 @@
         </w:trPr>
         <w:tc>
           <w:tcPr>
-            <w:tcW w:type="dxa" w:w="1400"/>
+            <w:tcW w:type="dxa" w:w="2340"/>
             <w:tcMar>
               <w:top w:w="90" w:type="dxa"/>
               <w:start w:w="110" w:type="dxa"/>
@@ -100,7 +100,7 @@
         </w:tc>
         <w:tc>
           <w:tcPr>
-            <w:tcW w:type="dxa" w:w="3000"/>
+            <w:tcW w:type="dxa" w:w="2340"/>
             <w:tcMar>
               <w:top w:w="90" w:type="dxa"/>
               <w:start w:w="110" w:type="dxa"/>
@@ -130,7 +130,7 @@
         </w:tc>
         <w:tc>
           <w:tcPr>
-            <w:tcW w:type="dxa" w:w="2200"/>
+            <w:tcW w:type="dxa" w:w="2340"/>
             <w:tcMar>
               <w:top w:w="90" w:type="dxa"/>
               <w:start w:w="110" w:type="dxa"/>
@@ -160,7 +160,7 @@
         </w:tc>
         <w:tc>
           <w:tcPr>
-            <w:tcW w:type="dxa" w:w="2760"/>
+            <w:tcW w:type="dxa" w:w="2340"/>
             <w:tcMar>
               <w:top w:w="90" w:type="dxa"/>
               <w:start w:w="110" w:type="dxa"/>
@@ -184,7 +184,7 @@
                 <w:color w:val="667069"/>
                 <w:sz w:val="15"/>
               </w:rPr>
-              <w:t>Control</w:t>
+              <w:t>Issue status</w:t>
             </w:r>
           </w:p>
         </w:tc>
@@ -192,7 +192,7 @@
       <w:tr>
         <w:tc>
           <w:tcPr>
-            <w:tcW w:type="dxa" w:w="1400"/>
+            <w:tcW w:type="dxa" w:w="2340"/>
             <w:tcMar>
               <w:top w:w="90" w:type="dxa"/>
               <w:start w:w="110" w:type="dxa"/>
@@ -222,7 +222,7 @@
         </w:tc>
         <w:tc>
           <w:tcPr>
-            <w:tcW w:type="dxa" w:w="3000"/>
+            <w:tcW w:type="dxa" w:w="2340"/>
             <w:tcMar>
               <w:top w:w="90" w:type="dxa"/>
               <w:start w:w="110" w:type="dxa"/>
@@ -252,7 +252,7 @@
         </w:tc>
         <w:tc>
           <w:tcPr>
-            <w:tcW w:type="dxa" w:w="2200"/>
+            <w:tcW w:type="dxa" w:w="2340"/>
             <w:tcMar>
               <w:top w:w="90" w:type="dxa"/>
               <w:start w:w="110" w:type="dxa"/>
@@ -282,7 +282,7 @@
         </w:tc>
         <w:tc>
           <w:tcPr>
-            <w:tcW w:type="dxa" w:w="2760"/>
+            <w:tcW w:type="dxa" w:w="2340"/>
             <w:tcMar>
               <w:top w:w="90" w:type="dxa"/>
               <w:start w:w="110" w:type="dxa"/>
@@ -306,7 +306,7 @@
                 <w:color w:val="17211B"/>
                 <w:sz w:val="17"/>
               </w:rPr>
-              <w:t>DRAFT</w:t>
+              <w:t>READY FOR REVIEW</w:t>
             </w:r>
           </w:p>
         </w:tc>
@@ -314,10 +314,10 @@
     </w:tbl>
     <w:p>
       <w:pPr>
-        <w:pStyle w:val="Heading1"/>
+        <w:pStyle w:val="Heading2"/>
       </w:pPr>
       <w:r>
-        <w:t>Verification finding</w:t>
+        <w:t>Observed condition</w:t>
       </w:r>
     </w:p>
     <w:tbl>
@@ -329,9 +329,7 @@
         <w:tblInd w:w="120" w:type="dxa"/>
       </w:tblPr>
       <w:tblGrid>
-        <w:gridCol w:w="2940"/>
-        <w:gridCol w:w="3210"/>
-        <w:gridCol w:w="3210"/>
+        <w:gridCol w:w="9360"/>
       </w:tblGrid>
       <w:tr>
         <w:trPr>
@@ -339,7 +337,7 @@
         </w:trPr>
         <w:tc>
           <w:tcPr>
-            <w:tcW w:type="dxa" w:w="2940"/>
+            <w:tcW w:type="dxa" w:w="9360"/>
             <w:tcMar>
               <w:top w:w="90" w:type="dxa"/>
               <w:start w:w="110" w:type="dxa"/>
@@ -363,67 +361,7 @@
                 <w:color w:val="667069"/>
                 <w:sz w:val="15"/>
               </w:rPr>
-              <w:t>Observed</w:t>
-            </w:r>
-          </w:p>
-        </w:tc>
-        <w:tc>
-          <w:tcPr>
-            <w:tcW w:type="dxa" w:w="3210"/>
-            <w:tcMar>
-              <w:top w:w="90" w:type="dxa"/>
-              <w:start w:w="110" w:type="dxa"/>
-              <w:bottom w:w="90" w:type="dxa"/>
-              <w:end w:w="110" w:type="dxa"/>
-            </w:tcMar>
-            <w:vAlign w:val="center"/>
-            <w:shd w:fill="F6F8F7"/>
-          </w:tcPr>
-          <w:p>
-            <w:pPr>
-              <w:spacing w:before="0" w:after="0" w:line="269" w:lineRule="auto"/>
-              <w:jc w:val="left"/>
-            </w:pPr>
-            <w:r/>
-            <w:r>
-              <w:rPr>
-                <w:rFonts w:ascii="Arial" w:hAnsi="Arial"/>
-                <w:b/>
-                <w:i w:val="0"/>
-                <w:color w:val="667069"/>
-                <w:sz w:val="15"/>
-              </w:rPr>
-              <w:t>Required / expected</w:t>
-            </w:r>
-          </w:p>
-        </w:tc>
-        <w:tc>
-          <w:tcPr>
-            <w:tcW w:type="dxa" w:w="3210"/>
-            <w:tcMar>
-              <w:top w:w="90" w:type="dxa"/>
-              <w:start w:w="110" w:type="dxa"/>
-              <w:bottom w:w="90" w:type="dxa"/>
-              <w:end w:w="110" w:type="dxa"/>
-            </w:tcMar>
-            <w:vAlign w:val="center"/>
-            <w:shd w:fill="F6F8F7"/>
-          </w:tcPr>
-          <w:p>
-            <w:pPr>
-              <w:spacing w:before="0" w:after="0" w:line="269" w:lineRule="auto"/>
-              <w:jc w:val="left"/>
-            </w:pPr>
-            <w:r/>
-            <w:r>
-              <w:rPr>
-                <w:rFonts w:ascii="Arial" w:hAnsi="Arial"/>
-                <w:b/>
-                <w:i w:val="0"/>
-                <w:color w:val="667069"/>
-                <w:sz w:val="15"/>
-              </w:rPr>
-              <w:t>Difference</w:t>
+              <w:t>Observed condition</w:t>
             </w:r>
           </w:p>
         </w:tc>
@@ -431,7 +369,7 @@
       <w:tr>
         <w:tc>
           <w:tcPr>
-            <w:tcW w:type="dxa" w:w="2940"/>
+            <w:tcW w:type="dxa" w:w="9360"/>
             <w:tcMar>
               <w:top w:w="90" w:type="dxa"/>
               <w:start w:w="110" w:type="dxa"/>
@@ -458,9 +396,66 @@
             </w:r>
           </w:p>
         </w:tc>
+      </w:tr>
+    </w:tbl>
+    <w:p>
+      <w:pPr>
+        <w:pStyle w:val="Heading2"/>
+      </w:pPr>
+      <w:r>
+        <w:t>Required / expected condition</w:t>
+      </w:r>
+    </w:p>
+    <w:tbl>
+      <w:tblPr>
+        <w:tblW w:type="dxa" w:w="9360"/>
+        <w:jc w:val="left"/>
+        <w:tblLayout w:type="fixed"/>
+        <w:tblLook w:firstColumn="1" w:firstRow="1" w:lastColumn="0" w:lastRow="0" w:noHBand="0" w:noVBand="1" w:val="04A0"/>
+        <w:tblInd w:w="120" w:type="dxa"/>
+      </w:tblPr>
+      <w:tblGrid>
+        <w:gridCol w:w="9360"/>
+      </w:tblGrid>
+      <w:tr>
+        <w:trPr>
+          <w:tblHeader/>
+        </w:trPr>
         <w:tc>
           <w:tcPr>
-            <w:tcW w:type="dxa" w:w="3210"/>
+            <w:tcW w:type="dxa" w:w="9360"/>
+            <w:tcMar>
+              <w:top w:w="90" w:type="dxa"/>
+              <w:start w:w="110" w:type="dxa"/>
+              <w:bottom w:w="90" w:type="dxa"/>
+              <w:end w:w="110" w:type="dxa"/>
+            </w:tcMar>
+            <w:vAlign w:val="center"/>
+            <w:shd w:fill="F6F8F7"/>
+          </w:tcPr>
+          <w:p>
+            <w:pPr>
+              <w:spacing w:before="0" w:after="0" w:line="269" w:lineRule="auto"/>
+              <w:jc w:val="left"/>
+            </w:pPr>
+            <w:r/>
+            <w:r>
+              <w:rPr>
+                <w:rFonts w:ascii="Arial" w:hAnsi="Arial"/>
+                <w:b/>
+                <w:i w:val="0"/>
+                <w:color w:val="667069"/>
+                <w:sz w:val="15"/>
+              </w:rPr>
+              <w:t>Required / expected condition</w:t>
+            </w:r>
+          </w:p>
+        </w:tc>
+      </w:tr>
+      <w:tr>
+        <w:tc>
+          <w:tcPr>
+            <w:tcW w:type="dxa" w:w="9360"/>
             <w:tcMar>
               <w:top w:w="90" w:type="dxa"/>
               <w:start w:w="110" w:type="dxa"/>
@@ -487,9 +482,66 @@
             </w:r>
           </w:p>
         </w:tc>
+      </w:tr>
+    </w:tbl>
+    <w:p>
+      <w:pPr>
+        <w:pStyle w:val="Heading2"/>
+      </w:pPr>
+      <w:r>
+        <w:t>Verified difference</w:t>
+      </w:r>
+    </w:p>
+    <w:tbl>
+      <w:tblPr>
+        <w:tblW w:type="dxa" w:w="9360"/>
+        <w:jc w:val="left"/>
+        <w:tblLayout w:type="fixed"/>
+        <w:tblLook w:firstColumn="1" w:firstRow="1" w:lastColumn="0" w:lastRow="0" w:noHBand="0" w:noVBand="1" w:val="04A0"/>
+        <w:tblInd w:w="120" w:type="dxa"/>
+      </w:tblPr>
+      <w:tblGrid>
+        <w:gridCol w:w="9360"/>
+      </w:tblGrid>
+      <w:tr>
+        <w:trPr>
+          <w:tblHeader/>
+        </w:trPr>
         <w:tc>
           <w:tcPr>
-            <w:tcW w:type="dxa" w:w="3210"/>
+            <w:tcW w:type="dxa" w:w="9360"/>
+            <w:tcMar>
+              <w:top w:w="90" w:type="dxa"/>
+              <w:start w:w="110" w:type="dxa"/>
+              <w:bottom w:w="90" w:type="dxa"/>
+              <w:end w:w="110" w:type="dxa"/>
+            </w:tcMar>
+            <w:vAlign w:val="center"/>
+            <w:shd w:fill="F6F8F7"/>
+          </w:tcPr>
+          <w:p>
+            <w:pPr>
+              <w:spacing w:before="0" w:after="0" w:line="269" w:lineRule="auto"/>
+              <w:jc w:val="left"/>
+            </w:pPr>
+            <w:r/>
+            <w:r>
+              <w:rPr>
+                <w:rFonts w:ascii="Arial" w:hAnsi="Arial"/>
+                <w:b/>
+                <w:i w:val="0"/>
+                <w:color w:val="667069"/>
+                <w:sz w:val="15"/>
+              </w:rPr>
+              <w:t>Verified difference</w:t>
+            </w:r>
+          </w:p>
+        </w:tc>
+      </w:tr>
+      <w:tr>
+        <w:tc>
+          <w:tcPr>
+            <w:tcW w:type="dxa" w:w="9360"/>
             <w:tcMar>
               <w:top w:w="90" w:type="dxa"/>
               <w:start w:w="110" w:type="dxa"/>
@@ -535,8 +587,7 @@
         <w:tblInd w:w="120" w:type="dxa"/>
       </w:tblPr>
       <w:tblGrid>
-        <w:gridCol w:w="2400"/>
-        <w:gridCol w:w="6960"/>
+        <w:gridCol w:w="9360"/>
       </w:tblGrid>
       <w:tr>
         <w:trPr>
@@ -544,7 +595,7 @@
         </w:trPr>
         <w:tc>
           <w:tcPr>
-            <w:tcW w:type="dxa" w:w="2400"/>
+            <w:tcW w:type="dxa" w:w="9360"/>
             <w:tcMar>
               <w:top w:w="90" w:type="dxa"/>
               <w:start w:w="110" w:type="dxa"/>
@@ -568,13 +619,15 @@
                 <w:color w:val="667069"/>
                 <w:sz w:val="15"/>
               </w:rPr>
-              <w:t>Route</w:t>
+              <w:t>Recommended route</w:t>
             </w:r>
           </w:p>
         </w:tc>
+      </w:tr>
+      <w:tr>
         <w:tc>
           <w:tcPr>
-            <w:tcW w:type="dxa" w:w="6960"/>
+            <w:tcW w:type="dxa" w:w="9360"/>
             <w:tcMar>
               <w:top w:w="90" w:type="dxa"/>
               <w:start w:w="110" w:type="dxa"/>
@@ -582,39 +635,6 @@
               <w:end w:w="110" w:type="dxa"/>
             </w:tcMar>
             <w:vAlign w:val="center"/>
-            <w:shd w:fill="F6F8F7"/>
-          </w:tcPr>
-          <w:p>
-            <w:pPr>
-              <w:spacing w:before="0" w:after="0" w:line="269" w:lineRule="auto"/>
-              <w:jc w:val="left"/>
-            </w:pPr>
-            <w:r/>
-            <w:r>
-              <w:rPr>
-                <w:rFonts w:ascii="Arial" w:hAnsi="Arial"/>
-                <w:b/>
-                <w:i w:val="0"/>
-                <w:color w:val="667069"/>
-                <w:sz w:val="15"/>
-              </w:rPr>
-              <w:t>Reviewer note</w:t>
-            </w:r>
-          </w:p>
-        </w:tc>
-      </w:tr>
-      <w:tr>
-        <w:tc>
-          <w:tcPr>
-            <w:tcW w:type="dxa" w:w="2400"/>
-            <w:tcMar>
-              <w:top w:w="90" w:type="dxa"/>
-              <w:start w:w="110" w:type="dxa"/>
-              <w:bottom w:w="90" w:type="dxa"/>
-              <w:end w:w="110" w:type="dxa"/>
-            </w:tcMar>
-            <w:vAlign w:val="center"/>
-            <w:shd w:fill="EFF9F3"/>
           </w:tcPr>
           <w:p>
             <w:pPr>
@@ -630,37 +650,7 @@
                 <w:color w:val="17211B"/>
                 <w:sz w:val="17"/>
               </w:rPr>
-              <w:t>FIELD CORRECTION PUNCH</w:t>
-            </w:r>
-          </w:p>
-        </w:tc>
-        <w:tc>
-          <w:tcPr>
-            <w:tcW w:type="dxa" w:w="6960"/>
-            <w:tcMar>
-              <w:top w:w="90" w:type="dxa"/>
-              <w:start w:w="110" w:type="dxa"/>
-              <w:bottom w:w="90" w:type="dxa"/>
-              <w:end w:w="110" w:type="dxa"/>
-            </w:tcMar>
-            <w:vAlign w:val="center"/>
-            <w:shd w:fill="EFF9F3"/>
-          </w:tcPr>
-          <w:p>
-            <w:pPr>
-              <w:spacing w:before="0" w:after="0" w:line="269" w:lineRule="auto"/>
-              <w:jc w:val="left"/>
-            </w:pPr>
-            <w:r/>
-            <w:r>
-              <w:rPr>
-                <w:rFonts w:ascii="Arial" w:hAnsi="Arial"/>
-                <w:b w:val="0"/>
-                <w:i w:val="0"/>
-                <w:color w:val="17211B"/>
-                <w:sz w:val="17"/>
-              </w:rPr>
-              <w:t>Installed centerline is 6 inches below the explicit approved drawing requirement.</w:t>
+              <w:t>field_correction_punch</w:t>
             </w:r>
           </w:p>
         </w:tc>
@@ -866,7 +856,7 @@
                 <w:color w:val="17211B"/>
                 <w:sz w:val="17"/>
               </w:rPr>
-              <w:t>Building: Residence / Space: Garage / Wall: East wall / Near: Entry door 2026-07-12T10:18:00-07:00</w:t>
+              <w:t>Residence / Garage / East wall / Entry door 2026-07-12T10:18:00-07:00</w:t>
             </w:r>
           </w:p>
         </w:tc>
@@ -955,7 +945,7 @@
                 <w:color w:val="17211B"/>
                 <w:sz w:val="17"/>
               </w:rPr>
-              <w:t>Building: Residence / Space: Garage / Wall: East wall / Near: Entry door 2026-07-12T10:18:20-07:00</w:t>
+              <w:t>Residence / Garage / East wall / Entry door 2026-07-12T10:18:20-07:00</w:t>
             </w:r>
           </w:p>
         </w:tc>
@@ -1044,7 +1034,7 @@
                 <w:color w:val="17211B"/>
                 <w:sz w:val="17"/>
               </w:rPr>
-              <w:t>Building: Residence / Space: Garage / Wall: East wall / Near: Entry door 2026-07-12T10:18:38-07:00</w:t>
+              <w:t>Residence / Garage / East wall / Entry door 2026-07-12T10:18:38-07:00</w:t>
             </w:r>
           </w:p>
         </w:tc>
@@ -1067,7 +1057,7 @@
         <w:drawing>
           <wp:inline xmlns:a="http://schemas.openxmlformats.org/drawingml/2006/main" xmlns:pic="http://schemas.openxmlformats.org/drawingml/2006/picture">
             <wp:extent cx="4389120" cy="3291840"/>
-            <wp:docPr id="1" name="Picture 1" descr="Garage east wall context. Building: Residence / Space: Garage / Wall: East wall / Near: Entry door" title="Garage east wall context"/>
+            <wp:docPr id="1" name="Picture 1" descr="Garage east wall context. Residence / Garage / East wall / Entry door" title="Garage east wall context"/>
             <wp:cNvGraphicFramePr>
               <a:graphicFrameLocks noChangeAspect="1"/>
             </wp:cNvGraphicFramePr>
@@ -1111,7 +1101,7 @@
           <w:color w:val="667069"/>
           <w:sz w:val="17"/>
         </w:rPr>
-        <w:t>Garage east wall context / Building: Residence / Space: Garage / Wall: East wall / Near: Entry door</w:t>
+        <w:t>Garage east wall context / Residence / Garage / East wall / Entry door</w:t>
       </w:r>
     </w:p>
     <w:p>
@@ -1123,7 +1113,7 @@
         <w:drawing>
           <wp:inline xmlns:a="http://schemas.openxmlformats.org/drawingml/2006/main" xmlns:pic="http://schemas.openxmlformats.org/drawingml/2006/picture">
             <wp:extent cx="4389120" cy="3291840"/>
-            <wp:docPr id="2" name="Picture 2" descr="GFCI centerline tape measurement. Building: Residence / Space: Garage / Wall: East wall / Near: Entry door" title="GFCI centerline tape measurement"/>
+            <wp:docPr id="2" name="Picture 2" descr="GFCI centerline tape measurement. Residence / Garage / East wall / Entry door" title="GFCI centerline tape measurement"/>
             <wp:cNvGraphicFramePr>
               <a:graphicFrameLocks noChangeAspect="1"/>
             </wp:cNvGraphicFramePr>
@@ -1167,7 +1157,7 @@
           <w:color w:val="667069"/>
           <w:sz w:val="17"/>
         </w:rPr>
-        <w:t>GFCI centerline tape measurement / Building: Residence / Space: Garage / Wall: East wall / Near: Entry door</w:t>
+        <w:t>GFCI centerline tape measurement / Residence / Garage / East wall / Entry door</w:t>
       </w:r>
     </w:p>
     <w:p>
@@ -1179,7 +1169,7 @@
         <w:drawing>
           <wp:inline xmlns:a="http://schemas.openxmlformats.org/drawingml/2006/main" xmlns:pic="http://schemas.openxmlformats.org/drawingml/2006/picture">
             <wp:extent cx="4389120" cy="3291840"/>
-            <wp:docPr id="3" name="Picture 3" descr="Receptacle rough-in detail. Building: Residence / Space: Garage / Wall: East wall / Near: Entry door" title="Receptacle rough-in detail"/>
+            <wp:docPr id="3" name="Picture 3" descr="Receptacle rough-in detail. Residence / Garage / East wall / Entry door" title="Receptacle rough-in detail"/>
             <wp:cNvGraphicFramePr>
               <a:graphicFrameLocks noChangeAspect="1"/>
             </wp:cNvGraphicFramePr>
@@ -1223,7 +1213,7 @@
           <w:color w:val="667069"/>
           <w:sz w:val="17"/>
         </w:rPr>
-        <w:t>Receptacle rough-in detail / Building: Residence / Space: Garage / Wall: East wall / Near: Entry door</w:t>
+        <w:t>Receptacle rough-in detail / Residence / Garage / East wall / Entry door</w:t>
       </w:r>
     </w:p>
     <w:p>
@@ -1449,7 +1439,7 @@
                 <w:color w:val="17211B"/>
                 <w:sz w:val="17"/>
               </w:rPr>
-              <w:t>E1.1 / Rev 2 / APPROVED SHA-256: f6b74c9a632092bcd911a2486d2601a3b73442f6358d9e5916de584edc5f710b</w:t>
+              <w:t>E1.1 / Rev 03 / APPROVED SHA-256: 85dceb1e6df4016fed87d520fd9c22a6049e351927123c6b587d697310a77fda</w:t>
             </w:r>
           </w:p>
         </w:tc>

</xml_diff>